<commit_message>
Update: fraud warning transcript P-553, all docs refreshed
</commit_message>
<xml_diff>
--- a/public/personal/costs/Affidavit_of_Damien_Englebrecht_Costs.docx
+++ b/public/personal/costs/Affidavit_of_Damien_Englebrecht_Costs.docx
@@ -2071,6 +2071,26 @@
           <w:sz w:val="24"/>
         </w:rPr>
         <w:t>- "God." (on more than one occasion when seeing further affidavit paragraphs)</w:t>
+      </w:r>
+    </w:p>
+    <w:p>
+      <w:pPr>
+        <w:spacing w:before="0" w:after="60"/>
+        <w:ind w:left="720"/>
+      </w:pPr>
+      <w:r>
+        <w:rPr>
+          <w:rFonts w:ascii="Times New Roman" w:hAnsi="Times New Roman"/>
+          <w:sz w:val="24"/>
+        </w:rPr>
+        <w:t xml:space="preserve">62. </w:t>
+      </w:r>
+      <w:r>
+        <w:rPr>
+          <w:rFonts w:ascii="Times New Roman" w:hAnsi="Times New Roman"/>
+          <w:sz w:val="24"/>
+        </w:rPr>
+        <w:t>On Day 3 of the trial, at transcript page P-553, Mr Schonell objected to Mr Hackett making serious allegations against a witness without evidence. Mr Hackett responded to His Honour: *"Your Honour knows that I'm conducting a fraud case here."* Despite being on notice that the allegations required the most scrupulous care, Mr Hackett and Mr Hirst proceeded with the fraud case at trial and adduced no evidence that proved any fraud.</w:t>
       </w:r>
     </w:p>
     <w:p>

</xml_diff>